<commit_message>
V3.1 -updates to BOM/NPRexports,parsingengine,generalUIconcerns
</commit_message>
<xml_diff>
--- a/Manuel.docx
+++ b/Manuel.docx
@@ -17,15 +17,7 @@
     </w:p>
     <w:p>
       <w:r>
-        <w:t xml:space="preserve">To use the NPR switchblade there </w:t>
-      </w:r>
-      <w:proofErr w:type="gramStart"/>
-      <w:r>
-        <w:t>4 input</w:t>
-      </w:r>
-      <w:proofErr w:type="gramEnd"/>
-      <w:r>
-        <w:t xml:space="preserve"> files. </w:t>
+        <w:t xml:space="preserve">To use the NPR switchblade there 4 input files. </w:t>
       </w:r>
     </w:p>
     <w:p>
@@ -41,11 +33,7 @@
         </w:rPr>
       </w:pPr>
       <w:r>
-        <w:t>K:\_Products\Component Numbering System\</w:t>
-      </w:r>
-      <w:proofErr w:type="gramStart"/>
-      <w:r>
-        <w:t>Extracts</w:t>
+        <w:t>K:\_Products\Component Numbering System\Extracts</w:t>
       </w:r>
       <w:r>
         <w:t xml:space="preserve">  </w:t>
@@ -58,7 +46,6 @@
         </w:rPr>
         <w:t>ITEMS.xlsx</w:t>
       </w:r>
-      <w:proofErr w:type="gramEnd"/>
     </w:p>
     <w:p>
       <w:pPr>
@@ -100,11 +87,7 @@
         </w:rPr>
       </w:pPr>
       <w:r>
-        <w:t xml:space="preserve">K:\_Products\Component Numbering </w:t>
-      </w:r>
-      <w:proofErr w:type="gramStart"/>
-      <w:r>
-        <w:t>System</w:t>
+        <w:t>K:\_Products\Component Numbering System</w:t>
       </w:r>
       <w:r>
         <w:t xml:space="preserve">  </w:t>
@@ -115,16 +98,7 @@
           <w:bCs/>
           <w:color w:val="156082" w:themeColor="accent1"/>
         </w:rPr>
-        <w:t>Component</w:t>
-      </w:r>
-      <w:proofErr w:type="gramEnd"/>
-      <w:r>
-        <w:rPr>
-          <w:b/>
-          <w:bCs/>
-          <w:color w:val="156082" w:themeColor="accent1"/>
-        </w:rPr>
-        <w:t xml:space="preserve"> Numbering System.xls</w:t>
+        <w:t>Component Numbering System.xls</w:t>
       </w:r>
     </w:p>
     <w:p>
@@ -149,18 +123,10 @@
         <w:t xml:space="preserve"> or list of </w:t>
       </w:r>
       <w:r>
-        <w:t xml:space="preserve">parts with </w:t>
-      </w:r>
-      <w:proofErr w:type="gramStart"/>
-      <w:r>
-        <w:t xml:space="preserve">the </w:t>
-      </w:r>
-      <w:r>
-        <w:t>at</w:t>
-      </w:r>
-      <w:proofErr w:type="gramEnd"/>
-      <w:r>
-        <w:t xml:space="preserve"> least</w:t>
+        <w:t xml:space="preserve">parts with the </w:t>
+      </w:r>
+      <w:r>
+        <w:t>at least</w:t>
       </w:r>
       <w:r>
         <w:t xml:space="preserve"> these two headers:</w:t>
@@ -178,11 +144,9 @@
           <w:bCs/>
         </w:rPr>
       </w:pPr>
-      <w:proofErr w:type="spellStart"/>
       <w:r>
         <w:t>manufacturer_part_number</w:t>
       </w:r>
-      <w:proofErr w:type="spellEnd"/>
     </w:p>
     <w:p>
       <w:pPr>
@@ -196,23 +160,13 @@
           <w:bCs/>
         </w:rPr>
       </w:pPr>
-      <w:proofErr w:type="gramStart"/>
       <w:r>
         <w:t>description</w:t>
       </w:r>
-      <w:proofErr w:type="gramEnd"/>
-    </w:p>
-    <w:p>
-      <w:r>
-        <w:t>(</w:t>
-      </w:r>
-      <w:proofErr w:type="gramStart"/>
-      <w:r>
-        <w:t>Its</w:t>
-      </w:r>
-      <w:proofErr w:type="gramEnd"/>
-      <w:r>
-        <w:t xml:space="preserve"> set up that you can have any header under any of the alias’s that are set up in the data_loader.py file under the </w:t>
+    </w:p>
+    <w:p>
+      <w:r>
+        <w:t xml:space="preserve">(Its set up that you can have any header under any of the alias’s that are set up in the data_loader.py file under the </w:t>
       </w:r>
       <w:r>
         <w:rPr>
@@ -265,41 +219,13 @@
         <w:rPr>
           <w:color w:val="000000" w:themeColor="text1"/>
         </w:rPr>
-        <w:t xml:space="preserve"> in the root, not to get confused with the “</w:t>
-      </w:r>
-      <w:proofErr w:type="spellStart"/>
-      <w:r>
-        <w:rPr>
-          <w:color w:val="000000" w:themeColor="text1"/>
-        </w:rPr>
-        <w:t>input_data</w:t>
-      </w:r>
-      <w:proofErr w:type="spellEnd"/>
-      <w:r>
-        <w:rPr>
-          <w:color w:val="000000" w:themeColor="text1"/>
-        </w:rPr>
-        <w:t>” folder in NPR_TOOL</w:t>
-      </w:r>
-      <w:r>
-        <w:rPr>
-          <w:color w:val="000000" w:themeColor="text1"/>
-        </w:rPr>
-        <w:t xml:space="preserve">. Rename the component numbering system as “components.xlsx”. I call the items.xlsx </w:t>
-      </w:r>
-      <w:proofErr w:type="spellStart"/>
-      <w:r>
-        <w:rPr>
-          <w:color w:val="000000" w:themeColor="text1"/>
-        </w:rPr>
-        <w:t>ERPinventory</w:t>
-      </w:r>
-      <w:proofErr w:type="spellEnd"/>
-      <w:r>
-        <w:rPr>
-          <w:color w:val="000000" w:themeColor="text1"/>
-        </w:rPr>
-        <w:t xml:space="preserve"> and I call the alternates extract (Misysitemlistconnectes.xlsx) the </w:t>
+        <w:t xml:space="preserve"> in the root</w:t>
+      </w:r>
+      <w:r>
+        <w:rPr>
+          <w:color w:val="000000" w:themeColor="text1"/>
+        </w:rPr>
+        <w:t xml:space="preserve">. Rename the component numbering system as “components.xlsx”. I call the items.xlsx ERPinventory and I call the alternates extract (Misysitemlistconnectes.xlsx) the </w:t>
       </w:r>
       <w:r>
         <w:rPr>
@@ -326,94 +252,40 @@
         <w:rPr>
           <w:color w:val="000000" w:themeColor="text1"/>
         </w:rPr>
-        <w:t xml:space="preserve">After setting up your environment, </w:t>
-      </w:r>
-      <w:proofErr w:type="gramStart"/>
-      <w:r>
-        <w:rPr>
-          <w:color w:val="000000" w:themeColor="text1"/>
-        </w:rPr>
-        <w:t>run :</w:t>
-      </w:r>
-      <w:proofErr w:type="gramEnd"/>
+        <w:t xml:space="preserve">After setting up your environment, run : </w:t>
+      </w:r>
+      <w:r>
+        <w:rPr>
+          <w:b/>
+          <w:bCs/>
+          <w:color w:val="000000" w:themeColor="text1"/>
+        </w:rPr>
+        <w:t xml:space="preserve">python -m NPR_TOOL.main </w:t>
+      </w:r>
+    </w:p>
+    <w:p>
+      <w:pPr>
+        <w:rPr>
+          <w:color w:val="000000" w:themeColor="text1"/>
+        </w:rPr>
+      </w:pPr>
+      <w:r>
+        <w:rPr>
+          <w:color w:val="000000" w:themeColor="text1"/>
+        </w:rPr>
+        <w:t>It may take a minute or two to load</w:t>
+      </w:r>
+      <w:r>
+        <w:rPr>
+          <w:color w:val="000000" w:themeColor="text1"/>
+        </w:rPr>
+        <w:t>.</w:t>
+      </w:r>
       <w:r>
         <w:rPr>
           <w:color w:val="000000" w:themeColor="text1"/>
         </w:rPr>
         <w:t xml:space="preserve"> </w:t>
-      </w:r>
-      <w:r>
-        <w:rPr>
-          <w:b/>
-          <w:bCs/>
-          <w:color w:val="000000" w:themeColor="text1"/>
-        </w:rPr>
-        <w:t xml:space="preserve">python -m </w:t>
-      </w:r>
-      <w:proofErr w:type="spellStart"/>
-      <w:r>
-        <w:rPr>
-          <w:b/>
-          <w:bCs/>
-          <w:color w:val="000000" w:themeColor="text1"/>
-        </w:rPr>
-        <w:t>NPR_TOOL.main</w:t>
-      </w:r>
-      <w:proofErr w:type="spellEnd"/>
-      <w:r>
-        <w:rPr>
-          <w:b/>
-          <w:bCs/>
-          <w:color w:val="000000" w:themeColor="text1"/>
-        </w:rPr>
-        <w:t xml:space="preserve"> </w:t>
-      </w:r>
-    </w:p>
-    <w:p>
-      <w:pPr>
-        <w:rPr>
-          <w:color w:val="000000" w:themeColor="text1"/>
-        </w:rPr>
-      </w:pPr>
-      <w:r>
-        <w:rPr>
-          <w:color w:val="000000" w:themeColor="text1"/>
-        </w:rPr>
-        <w:t xml:space="preserve">It may take a minute or two to load. </w:t>
-      </w:r>
-      <w:r>
-        <w:rPr>
-          <w:color w:val="000000" w:themeColor="text1"/>
-        </w:rPr>
-        <w:t xml:space="preserve">I have </w:t>
-      </w:r>
-      <w:proofErr w:type="gramStart"/>
-      <w:r>
-        <w:rPr>
-          <w:color w:val="000000" w:themeColor="text1"/>
-        </w:rPr>
-        <w:t>it set</w:t>
-      </w:r>
-      <w:proofErr w:type="gramEnd"/>
-      <w:r>
-        <w:rPr>
-          <w:color w:val="000000" w:themeColor="text1"/>
-        </w:rPr>
-        <w:t xml:space="preserve"> up to scrape through the component numbering system on </w:t>
-      </w:r>
-      <w:proofErr w:type="spellStart"/>
-      <w:r>
-        <w:rPr>
-          <w:color w:val="000000" w:themeColor="text1"/>
-        </w:rPr>
-        <w:t>start up</w:t>
-      </w:r>
-      <w:proofErr w:type="spellEnd"/>
-      <w:r>
-        <w:rPr>
-          <w:color w:val="000000" w:themeColor="text1"/>
-        </w:rPr>
-        <w:t xml:space="preserve">. </w:t>
       </w:r>
     </w:p>
     <w:p>
@@ -641,21 +513,7 @@
         <w:rPr>
           <w:color w:val="000000" w:themeColor="text1"/>
         </w:rPr>
-        <w:t xml:space="preserve">. You will see in your terminal the matching loading. It may take a few moments. For it to fully load, because it is rerunning the AI across the descriptions on any of the </w:t>
-      </w:r>
-      <w:proofErr w:type="spellStart"/>
-      <w:r>
-        <w:rPr>
-          <w:color w:val="000000" w:themeColor="text1"/>
-        </w:rPr>
-        <w:t>non fully</w:t>
-      </w:r>
-      <w:proofErr w:type="spellEnd"/>
-      <w:r>
-        <w:rPr>
-          <w:color w:val="000000" w:themeColor="text1"/>
-        </w:rPr>
-        <w:t xml:space="preserve"> matched manufacturing part numbers. Your BOM list will appear in the top scrollable panel.</w:t>
+        <w:t>. You will see in your terminal the matching loading. It may take a few moments. For it to fully load, because it is rerunning the AI across the descriptions on any of the non fully matched manufacturing part numbers. Your BOM list will appear in the top scrollable panel.</w:t>
       </w:r>
     </w:p>
     <w:p>
@@ -796,21 +654,13 @@
         <w:t>Panel,</w:t>
       </w:r>
       <w:r>
-        <w:t xml:space="preserve"> you will see a card. The card represents a company part number. Scroll down the panel to accept or reject this company part number for your matched BOM part. In the right panel, you will see all the information regarding this part number from the two extracts. Scroll down this panel to see the alternates under the company part number. You can select any of the </w:t>
-      </w:r>
-      <w:proofErr w:type="gramStart"/>
-      <w:r>
-        <w:t>alternates</w:t>
-      </w:r>
-      <w:proofErr w:type="gramEnd"/>
-      <w:r>
-        <w:t xml:space="preserve"> for an export or </w:t>
+        <w:t xml:space="preserve"> you will see a card. The card represents a company part number. Scroll down the panel to accept or reject this company part number for your matched BOM part. In the right panel, you will see all the information regarding this part number from the two extracts. Scroll down this panel to see the alternates under the company part number. You can select any of the alternates for an export or </w:t>
       </w:r>
       <w:r>
         <w:t>display</w:t>
       </w:r>
       <w:r>
-        <w:t xml:space="preserve"> their information in the panel instead (still super buggy). </w:t>
+        <w:t xml:space="preserve"> their information in the panel instead. </w:t>
       </w:r>
     </w:p>
     <w:p>
@@ -835,24 +685,7 @@
         <w:t xml:space="preserve">. The suggested CNS field is currently </w:t>
       </w:r>
       <w:r>
-        <w:t>broken;</w:t>
-      </w:r>
-      <w:r>
-        <w:t xml:space="preserve"> I’m trying to get it work with the </w:t>
-      </w:r>
-      <w:proofErr w:type="spellStart"/>
-      <w:r>
-        <w:t>sql</w:t>
-      </w:r>
-      <w:proofErr w:type="spellEnd"/>
-      <w:r>
-        <w:t xml:space="preserve"> database I have this running program running </w:t>
-      </w:r>
-      <w:r>
-        <w:t>off</w:t>
-      </w:r>
-      <w:r>
-        <w:t xml:space="preserve"> so you can also ignore that as well. You will see the part highlighted in the top panel. </w:t>
+        <w:t xml:space="preserve">box is being worked on for accuracy so ignore that for now. </w:t>
       </w:r>
     </w:p>
     <w:p>
@@ -901,15 +734,7 @@
     <w:p/>
     <w:p>
       <w:r>
-        <w:t xml:space="preserve">Do this with every part you have, and then click export NPR, name your output file, then save. </w:t>
-      </w:r>
-      <w:proofErr w:type="gramStart"/>
-      <w:r>
-        <w:t>All of</w:t>
-      </w:r>
-      <w:proofErr w:type="gramEnd"/>
-      <w:r>
-        <w:t xml:space="preserve"> the choices you made should be loaded into the file. The file will have 3 sheets, the </w:t>
+        <w:t xml:space="preserve">Do this with every part you have, and then click export NPR, name your output file, then save. All of the choices you made should be loaded into the file. The file will have 3 sheets, the </w:t>
       </w:r>
       <w:r>
         <w:rPr>
@@ -939,97 +764,19 @@
         <w:t>BOM sheet</w:t>
       </w:r>
       <w:r>
-        <w:t xml:space="preserve"> with </w:t>
-      </w:r>
-      <w:proofErr w:type="gramStart"/>
-      <w:r>
-        <w:t>all of</w:t>
-      </w:r>
-      <w:proofErr w:type="gramEnd"/>
-      <w:r>
-        <w:t xml:space="preserve"> the choices you </w:t>
-      </w:r>
-      <w:proofErr w:type="gramStart"/>
-      <w:r>
-        <w:t>made  It</w:t>
-      </w:r>
-      <w:proofErr w:type="gramEnd"/>
-      <w:r>
-        <w:t xml:space="preserve"> will prompt you to include any items that have 3 or more alternates to keep in your </w:t>
-      </w:r>
-      <w:proofErr w:type="spellStart"/>
-      <w:r>
-        <w:t>npr</w:t>
-      </w:r>
-      <w:proofErr w:type="spellEnd"/>
-      <w:r>
-        <w:t xml:space="preserve"> export. You can say yes to all of them, or no, either way all your choices will still be saved into the BOM sheet of the excel file. The BOM excel sheet is unformatted right now, so it </w:t>
-      </w:r>
-      <w:proofErr w:type="gramStart"/>
-      <w:r>
-        <w:t>wont</w:t>
-      </w:r>
-      <w:proofErr w:type="gramEnd"/>
-      <w:r>
-        <w:t xml:space="preserve"> be formatted per the ELAN BOM file, and will just be a list </w:t>
-      </w:r>
-      <w:proofErr w:type="gramStart"/>
-      <w:r>
-        <w:t>( I</w:t>
-      </w:r>
-      <w:proofErr w:type="gramEnd"/>
-      <w:r>
-        <w:t xml:space="preserve"> was working on this the other day to fix exporting logic). One thing </w:t>
-      </w:r>
-      <w:r>
-        <w:t>I’m</w:t>
-      </w:r>
-      <w:r>
-        <w:t xml:space="preserve"> working on is the description logic, you will notice the description of the item saved in the BOM sheet will be your BOM description and not the description from inventory, even if it was a full match. I broke the logic trying to implement that description UI changer that makes that happen. </w:t>
-      </w:r>
-      <w:proofErr w:type="gramStart"/>
-      <w:r>
-        <w:t>So</w:t>
-      </w:r>
-      <w:proofErr w:type="gramEnd"/>
-      <w:r>
-        <w:t xml:space="preserve"> you will have to </w:t>
-      </w:r>
-      <w:r>
-        <w:t xml:space="preserve">manually copy and </w:t>
-      </w:r>
-      <w:proofErr w:type="spellStart"/>
-      <w:r>
-        <w:t>past</w:t>
-      </w:r>
-      <w:proofErr w:type="spellEnd"/>
-      <w:r>
-        <w:t xml:space="preserve"> </w:t>
-      </w:r>
-      <w:proofErr w:type="gramStart"/>
-      <w:r>
-        <w:t>those description</w:t>
-      </w:r>
-      <w:proofErr w:type="gramEnd"/>
-      <w:r>
-        <w:t xml:space="preserve"> yourself in this test version.</w:t>
-      </w:r>
-    </w:p>
-    <w:p>
-      <w:r>
-        <w:t xml:space="preserve">That’s the entire functionality of </w:t>
-      </w:r>
-      <w:r>
-        <w:t xml:space="preserve">this </w:t>
-      </w:r>
-      <w:r>
-        <w:t xml:space="preserve">so far. It functionally </w:t>
-      </w:r>
-      <w:r>
-        <w:t>works but</w:t>
-      </w:r>
-      <w:r>
-        <w:t xml:space="preserve"> still requires a lot of fiddling with. </w:t>
+        <w:t xml:space="preserve"> with all of the choices you made  It will prompt you to include any items that have 3 or more alternates to keep in your </w:t>
+      </w:r>
+      <w:r>
+        <w:t>NPR</w:t>
+      </w:r>
+      <w:r>
+        <w:t xml:space="preserve"> export.</w:t>
+      </w:r>
+      <w:r>
+        <w:t xml:space="preserve"> Based on your choices it will auto populate a BOM, an NPR and the need for approval document formatted. You can change your export description of the part in the box in the middle Heder. You can change the company part number as well. If you select a card from the internal list matched (meaning exists in the company inventory) these options are locked, as to not create confusion. These will not affect the inventory system if changes are made and is purely for exporting functionality. External card selection will be for population for alternates or substitutes found via: api connections or external skew connections. This functionality is still being tested</w:t>
+      </w:r>
+      <w:r>
+        <w:t>.</w:t>
       </w:r>
     </w:p>
     <w:sectPr>

</xml_diff>